<commit_message>
added jenkins to sudoers
</commit_message>
<xml_diff>
--- a/Screenshots & Notes/Week 7 and 8 (Kubernetes + Frontend + Backend ).docx
+++ b/Screenshots & Notes/Week 7 and 8 (Kubernetes + Frontend + Backend ).docx
@@ -5109,6 +5109,7 @@
           <w:numId w:val="0"/>
         </w:numPr>
         <w:spacing w:line="360" w:lineRule="auto"/>
+        <w:ind w:leftChars="0"/>
         <w:jc w:val="left"/>
         <w:rPr>
           <w:rFonts w:hint="default"/>
@@ -5125,15 +5126,188 @@
       <w:pPr>
         <w:numPr>
           <w:ilvl w:val="0"/>
-          <w:numId w:val="0"/>
-        </w:numPr>
-        <w:spacing w:line="360" w:lineRule="auto"/>
-        <w:ind w:leftChars="0"/>
+          <w:numId w:val="9"/>
+        </w:numPr>
+        <w:spacing w:line="360" w:lineRule="auto"/>
+        <w:ind w:left="0" w:leftChars="0" w:firstLine="0" w:firstLineChars="0"/>
         <w:jc w:val="left"/>
         <w:rPr>
           <w:rFonts w:hint="default"/>
           <w:b w:val="0"/>
           <w:bCs w:val="0"/>
+          <w:color w:val="auto"/>
+          <w:sz w:val="24"/>
+          <w:szCs w:val="24"/>
+          <w:lang w:val="en-GB"/>
+        </w:rPr>
+      </w:pPr>
+      <w:r>
+        <w:rPr>
+          <w:rFonts w:hint="default"/>
+          <w:b w:val="0"/>
+          <w:bCs w:val="0"/>
+          <w:color w:val="auto"/>
+          <w:sz w:val="24"/>
+          <w:szCs w:val="24"/>
+          <w:lang w:val="en-GB"/>
+        </w:rPr>
+        <w:t xml:space="preserve">Give Jenkins access to the k3s config: </w:t>
+      </w:r>
+    </w:p>
+    <w:p>
+      <w:pPr>
+        <w:numPr>
+          <w:numId w:val="0"/>
+        </w:numPr>
+        <w:spacing w:line="360" w:lineRule="auto"/>
+        <w:ind w:leftChars="0"/>
+        <w:jc w:val="left"/>
+        <w:rPr>
+          <w:rFonts w:hint="default"/>
+          <w:b w:val="0"/>
+          <w:bCs w:val="0"/>
+          <w:color w:val="00B050"/>
+          <w:sz w:val="24"/>
+          <w:szCs w:val="24"/>
+          <w:lang w:val="en-GB"/>
+        </w:rPr>
+      </w:pPr>
+      <w:r>
+        <w:rPr>
+          <w:rFonts w:hint="default"/>
+          <w:b w:val="0"/>
+          <w:bCs w:val="0"/>
+          <w:color w:val="00B050"/>
+          <w:sz w:val="24"/>
+          <w:szCs w:val="24"/>
+          <w:lang w:val="en-GB"/>
+        </w:rPr>
+        <w:t xml:space="preserve">sudo chmod 644 /etc/rancher/k3s/k3s.yaml </w:t>
+      </w:r>
+    </w:p>
+    <w:p>
+      <w:pPr>
+        <w:numPr>
+          <w:numId w:val="0"/>
+        </w:numPr>
+        <w:spacing w:line="360" w:lineRule="auto"/>
+        <w:ind w:leftChars="0"/>
+        <w:jc w:val="left"/>
+        <w:rPr>
+          <w:rFonts w:hint="default"/>
+          <w:b w:val="0"/>
+          <w:bCs w:val="0"/>
+          <w:color w:val="00B050"/>
+          <w:sz w:val="24"/>
+          <w:szCs w:val="24"/>
+          <w:lang w:val="en-GB"/>
+        </w:rPr>
+      </w:pPr>
+      <w:r>
+        <w:rPr>
+          <w:rFonts w:hint="default"/>
+          <w:b w:val="0"/>
+          <w:bCs w:val="0"/>
+          <w:color w:val="00B050"/>
+          <w:sz w:val="24"/>
+          <w:szCs w:val="24"/>
+          <w:lang w:val="en-GB"/>
+        </w:rPr>
+        <w:t>sudo usermod -aG sudo jenkins</w:t>
+      </w:r>
+    </w:p>
+    <w:p>
+      <w:pPr>
+        <w:numPr>
+          <w:ilvl w:val="0"/>
+          <w:numId w:val="9"/>
+        </w:numPr>
+        <w:spacing w:line="360" w:lineRule="auto"/>
+        <w:ind w:left="0" w:leftChars="0" w:firstLine="0" w:firstLineChars="0"/>
+        <w:jc w:val="left"/>
+        <w:rPr>
+          <w:rFonts w:hint="default"/>
+          <w:b w:val="0"/>
+          <w:bCs w:val="0"/>
+          <w:color w:val="auto"/>
+          <w:sz w:val="24"/>
+          <w:szCs w:val="24"/>
+          <w:lang w:val="en-GB"/>
+        </w:rPr>
+      </w:pPr>
+      <w:r>
+        <w:rPr>
+          <w:rFonts w:hint="default"/>
+          <w:b w:val="0"/>
+          <w:bCs w:val="0"/>
+          <w:color w:val="auto"/>
+          <w:sz w:val="24"/>
+          <w:szCs w:val="24"/>
+          <w:lang w:val="en-GB"/>
+        </w:rPr>
+        <w:t>Add Jenkins to sudoers so it can run sudo kubectl without a password prompt</w:t>
+      </w:r>
+    </w:p>
+    <w:p>
+      <w:pPr>
+        <w:numPr>
+          <w:ilvl w:val="0"/>
+          <w:numId w:val="13"/>
+        </w:numPr>
+        <w:spacing w:line="360" w:lineRule="auto"/>
+        <w:ind w:left="420" w:leftChars="0" w:hanging="420" w:firstLineChars="0"/>
+        <w:jc w:val="left"/>
+        <w:rPr>
+          <w:rFonts w:ascii="SimSun" w:hAnsi="SimSun" w:eastAsia="SimSun" w:cs="SimSun"/>
+          <w:color w:val="00B050"/>
+          <w:sz w:val="24"/>
+          <w:szCs w:val="24"/>
+        </w:rPr>
+      </w:pPr>
+      <w:r>
+        <w:rPr>
+          <w:rFonts w:hint="default"/>
+          <w:b w:val="0"/>
+          <w:bCs w:val="0"/>
+          <w:color w:val="auto"/>
+          <w:sz w:val="24"/>
+          <w:szCs w:val="24"/>
+          <w:lang w:val="en-GB"/>
+        </w:rPr>
+        <w:t>SSH into your VM and run:</w:t>
+      </w:r>
+      <w:r>
+        <w:rPr>
+          <w:rFonts w:hint="default"/>
+          <w:b w:val="0"/>
+          <w:bCs w:val="0"/>
+          <w:color w:val="0070C0"/>
+          <w:sz w:val="24"/>
+          <w:szCs w:val="24"/>
+          <w:lang w:val="en-GB"/>
+        </w:rPr>
+        <w:t xml:space="preserve"> </w:t>
+      </w:r>
+      <w:r>
+        <w:rPr>
+          <w:rFonts w:ascii="SimSun" w:hAnsi="SimSun" w:eastAsia="SimSun" w:cs="SimSun"/>
+          <w:color w:val="00B050"/>
+          <w:sz w:val="24"/>
+          <w:szCs w:val="24"/>
+        </w:rPr>
+        <w:t>sudo visudo</w:t>
+      </w:r>
+    </w:p>
+    <w:p>
+      <w:pPr>
+        <w:numPr>
+          <w:numId w:val="0"/>
+        </w:numPr>
+        <w:spacing w:line="360" w:lineRule="auto"/>
+        <w:ind w:leftChars="0"/>
+        <w:jc w:val="left"/>
+        <w:rPr>
+          <w:rFonts w:hint="default" w:ascii="Calibri" w:hAnsi="Calibri" w:eastAsia="SimSun" w:cs="Calibri"/>
           <w:color w:val="FF0000"/>
           <w:sz w:val="24"/>
           <w:szCs w:val="24"/>
@@ -5142,131 +5316,72 @@
       </w:pPr>
       <w:r>
         <w:rPr>
-          <w:rFonts w:hint="default"/>
-          <w:b w:val="0"/>
-          <w:bCs w:val="0"/>
+          <w:rFonts w:hint="default" w:ascii="Calibri" w:hAnsi="Calibri" w:eastAsia="SimSun" w:cs="Calibri"/>
           <w:color w:val="FF0000"/>
           <w:sz w:val="24"/>
           <w:szCs w:val="24"/>
           <w:lang w:val="en-GB"/>
         </w:rPr>
-        <w:t xml:space="preserve">Push </w:t>
-      </w:r>
-    </w:p>
-    <w:p>
-      <w:pPr>
-        <w:numPr>
-          <w:ilvl w:val="0"/>
+        <w:t>This opens the sudoers file safely. Scroll to the bottom and add this line:</w:t>
+      </w:r>
+    </w:p>
+    <w:p>
+      <w:pPr>
+        <w:numPr>
           <w:numId w:val="0"/>
         </w:numPr>
         <w:spacing w:line="360" w:lineRule="auto"/>
         <w:ind w:leftChars="0"/>
         <w:jc w:val="left"/>
         <w:rPr>
-          <w:rFonts w:hint="default"/>
-          <w:b w:val="0"/>
-          <w:bCs w:val="0"/>
-          <w:color w:val="FF0000"/>
-          <w:sz w:val="24"/>
-          <w:szCs w:val="24"/>
-          <w:lang w:val="en-GB"/>
-        </w:rPr>
-      </w:pPr>
-      <w:r>
-        <w:rPr>
-          <w:rFonts w:hint="default"/>
-          <w:b w:val="0"/>
-          <w:bCs w:val="0"/>
-          <w:color w:val="FF0000"/>
-          <w:sz w:val="24"/>
-          <w:szCs w:val="24"/>
-          <w:lang w:val="en-GB"/>
-        </w:rPr>
-        <w:t>git add .</w:t>
-      </w:r>
-      <w:r>
-        <w:rPr>
-          <w:rFonts w:hint="default"/>
-          <w:b w:val="0"/>
-          <w:bCs w:val="0"/>
-          <w:color w:val="FF0000"/>
-          <w:sz w:val="24"/>
-          <w:szCs w:val="24"/>
-          <w:lang w:val="en-GB"/>
-        </w:rPr>
-        <w:br w:type="textWrapping"/>
-      </w:r>
-      <w:r>
-        <w:rPr>
-          <w:rFonts w:hint="default"/>
-          <w:b w:val="0"/>
-          <w:bCs w:val="0"/>
-          <w:color w:val="FF0000"/>
-          <w:sz w:val="24"/>
-          <w:szCs w:val="24"/>
-          <w:lang w:val="en-GB"/>
-        </w:rPr>
-        <w:t>git commit -m "add k8s deploy stage"</w:t>
-      </w:r>
-      <w:r>
-        <w:rPr>
-          <w:rFonts w:hint="default"/>
-          <w:b w:val="0"/>
-          <w:bCs w:val="0"/>
-          <w:color w:val="FF0000"/>
-          <w:sz w:val="24"/>
-          <w:szCs w:val="24"/>
-          <w:lang w:val="en-GB"/>
-        </w:rPr>
-        <w:br w:type="textWrapping"/>
-      </w:r>
-      <w:r>
-        <w:rPr>
-          <w:rFonts w:hint="default"/>
-          <w:b w:val="0"/>
-          <w:bCs w:val="0"/>
-          <w:color w:val="FF0000"/>
-          <w:sz w:val="24"/>
-          <w:szCs w:val="24"/>
-          <w:lang w:val="en-GB"/>
-        </w:rPr>
-        <w:t>git push</w:t>
-      </w:r>
-    </w:p>
-    <w:p>
-      <w:pPr>
-        <w:numPr>
-          <w:ilvl w:val="0"/>
-          <w:numId w:val="0"/>
-        </w:numPr>
-        <w:spacing w:line="360" w:lineRule="auto"/>
-        <w:ind w:leftChars="0"/>
+          <w:rFonts w:hint="default" w:ascii="Calibri" w:hAnsi="Calibri" w:eastAsia="SimSun" w:cs="Calibri"/>
+          <w:color w:val="auto"/>
+          <w:sz w:val="24"/>
+          <w:szCs w:val="24"/>
+          <w:lang w:val="en-GB"/>
+        </w:rPr>
+      </w:pPr>
+      <w:r>
+        <w:rPr>
+          <w:rFonts w:hint="default" w:ascii="Calibri" w:hAnsi="Calibri" w:eastAsia="SimSun" w:cs="Calibri"/>
+          <w:color w:val="auto"/>
+          <w:sz w:val="24"/>
+          <w:szCs w:val="24"/>
+          <w:lang w:val="en-GB"/>
+        </w:rPr>
+        <w:t>jenkins ALL=(ALL) NOPASSWD: /usr/local/bin/kubectl</w:t>
+      </w:r>
+    </w:p>
+    <w:p>
+      <w:pPr>
+        <w:numPr>
+          <w:numId w:val="0"/>
+        </w:numPr>
+        <w:spacing w:line="360" w:lineRule="auto"/>
         <w:jc w:val="left"/>
         <w:rPr>
           <w:rFonts w:hint="default"/>
           <w:b w:val="0"/>
           <w:bCs w:val="0"/>
-          <w:color w:val="FF0000"/>
-          <w:sz w:val="24"/>
-          <w:szCs w:val="24"/>
-          <w:lang w:val="en-GB"/>
-        </w:rPr>
-      </w:pPr>
-    </w:p>
-    <w:p>
-      <w:pPr>
-        <w:numPr>
-          <w:ilvl w:val="0"/>
-          <w:numId w:val="0"/>
-        </w:numPr>
-        <w:spacing w:line="360" w:lineRule="auto"/>
-        <w:ind w:leftChars="0"/>
+          <w:color w:val="auto"/>
+          <w:sz w:val="24"/>
+          <w:szCs w:val="24"/>
+          <w:lang w:val="en-GB"/>
+        </w:rPr>
+      </w:pPr>
+    </w:p>
+    <w:p>
+      <w:pPr>
+        <w:numPr>
+          <w:numId w:val="0"/>
+        </w:numPr>
+        <w:spacing w:line="360" w:lineRule="auto"/>
         <w:jc w:val="left"/>
         <w:rPr>
           <w:rFonts w:hint="default"/>
           <w:b w:val="0"/>
           <w:bCs w:val="0"/>
-          <w:color w:val="FF0000"/>
+          <w:color w:val="auto"/>
           <w:sz w:val="24"/>
           <w:szCs w:val="24"/>
           <w:lang w:val="en-GB"/>
@@ -5274,6 +5389,240 @@
       </w:pPr>
       <w:bookmarkStart w:id="0" w:name="_GoBack"/>
       <w:bookmarkEnd w:id="0"/>
+    </w:p>
+    <w:p>
+      <w:pPr>
+        <w:numPr>
+          <w:numId w:val="0"/>
+        </w:numPr>
+        <w:spacing w:line="360" w:lineRule="auto"/>
+        <w:jc w:val="left"/>
+        <w:rPr>
+          <w:rFonts w:hint="default"/>
+          <w:b w:val="0"/>
+          <w:bCs w:val="0"/>
+          <w:color w:val="auto"/>
+          <w:sz w:val="24"/>
+          <w:szCs w:val="24"/>
+          <w:lang w:val="en-GB"/>
+        </w:rPr>
+      </w:pPr>
+    </w:p>
+    <w:p>
+      <w:pPr>
+        <w:numPr>
+          <w:ilvl w:val="0"/>
+          <w:numId w:val="0"/>
+        </w:numPr>
+        <w:spacing w:line="360" w:lineRule="auto"/>
+        <w:ind w:leftChars="0"/>
+        <w:jc w:val="left"/>
+        <w:rPr>
+          <w:rFonts w:hint="default"/>
+          <w:b w:val="0"/>
+          <w:bCs w:val="0"/>
+          <w:color w:val="auto"/>
+          <w:sz w:val="24"/>
+          <w:szCs w:val="24"/>
+          <w:lang w:val="en-GB"/>
+        </w:rPr>
+      </w:pPr>
+      <w:r>
+        <w:rPr>
+          <w:rFonts w:hint="default"/>
+          <w:b w:val="0"/>
+          <w:bCs w:val="0"/>
+          <w:color w:val="auto"/>
+          <w:sz w:val="24"/>
+          <w:szCs w:val="24"/>
+          <w:lang w:val="en-GB"/>
+        </w:rPr>
+        <w:t xml:space="preserve">Test. </w:t>
+      </w:r>
+    </w:p>
+    <w:p>
+      <w:pPr>
+        <w:numPr>
+          <w:ilvl w:val="0"/>
+          <w:numId w:val="0"/>
+        </w:numPr>
+        <w:spacing w:line="360" w:lineRule="auto"/>
+        <w:ind w:leftChars="0"/>
+        <w:jc w:val="left"/>
+        <w:rPr>
+          <w:rFonts w:hint="default"/>
+          <w:b w:val="0"/>
+          <w:bCs w:val="0"/>
+          <w:color w:val="FF0000"/>
+          <w:sz w:val="24"/>
+          <w:szCs w:val="24"/>
+          <w:lang w:val="en-GB"/>
+        </w:rPr>
+      </w:pPr>
+      <w:r>
+        <w:rPr>
+          <w:rFonts w:hint="default"/>
+          <w:b w:val="0"/>
+          <w:bCs w:val="0"/>
+          <w:color w:val="FF0000"/>
+          <w:sz w:val="24"/>
+          <w:szCs w:val="24"/>
+          <w:lang w:val="en-GB"/>
+        </w:rPr>
+        <w:t>git add .</w:t>
+      </w:r>
+      <w:r>
+        <w:rPr>
+          <w:rFonts w:hint="default"/>
+          <w:b w:val="0"/>
+          <w:bCs w:val="0"/>
+          <w:color w:val="FF0000"/>
+          <w:sz w:val="24"/>
+          <w:szCs w:val="24"/>
+          <w:lang w:val="en-GB"/>
+        </w:rPr>
+        <w:br w:type="textWrapping"/>
+      </w:r>
+      <w:r>
+        <w:rPr>
+          <w:rFonts w:hint="default"/>
+          <w:b w:val="0"/>
+          <w:bCs w:val="0"/>
+          <w:color w:val="FF0000"/>
+          <w:sz w:val="24"/>
+          <w:szCs w:val="24"/>
+          <w:lang w:val="en-GB"/>
+        </w:rPr>
+        <w:t>git commit -m "add jenkins cicd"</w:t>
+      </w:r>
+      <w:r>
+        <w:rPr>
+          <w:rFonts w:hint="default"/>
+          <w:b w:val="0"/>
+          <w:bCs w:val="0"/>
+          <w:color w:val="FF0000"/>
+          <w:sz w:val="24"/>
+          <w:szCs w:val="24"/>
+          <w:lang w:val="en-GB"/>
+        </w:rPr>
+        <w:br w:type="textWrapping"/>
+      </w:r>
+      <w:r>
+        <w:rPr>
+          <w:rFonts w:hint="default"/>
+          <w:b w:val="0"/>
+          <w:bCs w:val="0"/>
+          <w:color w:val="FF0000"/>
+          <w:sz w:val="24"/>
+          <w:szCs w:val="24"/>
+          <w:lang w:val="en-GB"/>
+        </w:rPr>
+        <w:t>git push</w:t>
+      </w:r>
+    </w:p>
+    <w:p>
+      <w:pPr>
+        <w:numPr>
+          <w:ilvl w:val="0"/>
+          <w:numId w:val="0"/>
+        </w:numPr>
+        <w:spacing w:line="360" w:lineRule="auto"/>
+        <w:ind w:leftChars="0"/>
+        <w:jc w:val="left"/>
+        <w:rPr>
+          <w:rFonts w:hint="default"/>
+          <w:b w:val="0"/>
+          <w:bCs w:val="0"/>
+          <w:color w:val="FF0000"/>
+          <w:sz w:val="24"/>
+          <w:szCs w:val="24"/>
+          <w:lang w:val="en-GB"/>
+        </w:rPr>
+      </w:pPr>
+    </w:p>
+    <w:p>
+      <w:pPr>
+        <w:numPr>
+          <w:ilvl w:val="0"/>
+          <w:numId w:val="0"/>
+        </w:numPr>
+        <w:spacing w:line="360" w:lineRule="auto"/>
+        <w:ind w:leftChars="0"/>
+        <w:jc w:val="left"/>
+        <w:rPr>
+          <w:rFonts w:hint="default"/>
+          <w:b w:val="0"/>
+          <w:bCs w:val="0"/>
+          <w:color w:val="auto"/>
+          <w:sz w:val="24"/>
+          <w:szCs w:val="24"/>
+          <w:lang w:val="en-GB"/>
+        </w:rPr>
+      </w:pPr>
+      <w:r>
+        <w:rPr>
+          <w:rFonts w:hint="default"/>
+          <w:b w:val="0"/>
+          <w:bCs w:val="0"/>
+          <w:color w:val="auto"/>
+          <w:sz w:val="24"/>
+          <w:szCs w:val="24"/>
+          <w:lang w:val="en-GB"/>
+        </w:rPr>
+        <w:t>Jenkins will  securely push images and automatically deploy updates to Kubernetes, this completes a full CI/CD pipeline.</w:t>
+      </w:r>
+    </w:p>
+    <w:p>
+      <w:pPr>
+        <w:numPr>
+          <w:ilvl w:val="0"/>
+          <w:numId w:val="0"/>
+        </w:numPr>
+        <w:spacing w:line="360" w:lineRule="auto"/>
+        <w:ind w:leftChars="0"/>
+        <w:jc w:val="left"/>
+        <w:rPr>
+          <w:rFonts w:hint="default"/>
+          <w:b w:val="0"/>
+          <w:bCs w:val="0"/>
+          <w:color w:val="auto"/>
+          <w:sz w:val="24"/>
+          <w:szCs w:val="24"/>
+          <w:lang w:val="en-GB"/>
+        </w:rPr>
+      </w:pPr>
+    </w:p>
+    <w:p>
+      <w:pPr>
+        <w:numPr>
+          <w:ilvl w:val="0"/>
+          <w:numId w:val="0"/>
+        </w:numPr>
+        <w:spacing w:line="360" w:lineRule="auto"/>
+        <w:ind w:leftChars="0"/>
+        <w:jc w:val="left"/>
+        <w:rPr>
+          <w:rFonts w:hint="default"/>
+          <w:b w:val="0"/>
+          <w:bCs w:val="0"/>
+          <w:color w:val="auto"/>
+          <w:sz w:val="24"/>
+          <w:szCs w:val="24"/>
+          <w:lang w:val="en-GB"/>
+        </w:rPr>
+      </w:pPr>
+      <w:r>
+        <w:rPr>
+          <w:rFonts w:hint="default"/>
+          <w:b w:val="0"/>
+          <w:bCs w:val="0"/>
+          <w:color w:val="auto"/>
+          <w:sz w:val="24"/>
+          <w:szCs w:val="24"/>
+          <w:lang w:val="en-GB"/>
+        </w:rPr>
+        <w:t xml:space="preserve">Verify the APP updated on changes. </w:t>
+      </w:r>
     </w:p>
     <w:sectPr>
       <w:pgSz w:w="11906" w:h="16838"/>
@@ -5348,6 +5697,29 @@
     </w:lvl>
   </w:abstractNum>
   <w:abstractNum w:abstractNumId="3">
+    <w:nsid w:val="C7888F19"/>
+    <w:multiLevelType w:val="singleLevel"/>
+    <w:tmpl w:val="C7888F19"/>
+    <w:lvl w:ilvl="0" w:tentative="0">
+      <w:start w:val="1"/>
+      <w:numFmt w:val="bullet"/>
+      <w:lvlText w:val=""/>
+      <w:lvlJc w:val="left"/>
+      <w:pPr>
+        <w:tabs>
+          <w:tab w:val="left" w:pos="420"/>
+        </w:tabs>
+        <w:ind w:left="420" w:leftChars="0" w:hanging="420" w:firstLineChars="0"/>
+      </w:pPr>
+      <w:rPr>
+        <w:rFonts w:hint="default" w:ascii="Wingdings" w:hAnsi="Wingdings"/>
+        <w:color w:val="auto"/>
+        <w:sz w:val="18"/>
+        <w:szCs w:val="18"/>
+      </w:rPr>
+    </w:lvl>
+  </w:abstractNum>
+  <w:abstractNum w:abstractNumId="4">
     <w:nsid w:val="D4180F91"/>
     <w:multiLevelType w:val="singleLevel"/>
     <w:tmpl w:val="D4180F91"/>
@@ -5367,7 +5739,7 @@
       </w:rPr>
     </w:lvl>
   </w:abstractNum>
-  <w:abstractNum w:abstractNumId="4">
+  <w:abstractNum w:abstractNumId="5">
     <w:nsid w:val="DA5EC560"/>
     <w:multiLevelType w:val="singleLevel"/>
     <w:tmpl w:val="DA5EC560"/>
@@ -5390,7 +5762,7 @@
       </w:rPr>
     </w:lvl>
   </w:abstractNum>
-  <w:abstractNum w:abstractNumId="5">
+  <w:abstractNum w:abstractNumId="6">
     <w:nsid w:val="E24E84D6"/>
     <w:multiLevelType w:val="singleLevel"/>
     <w:tmpl w:val="E24E84D6"/>
@@ -5412,7 +5784,7 @@
       </w:rPr>
     </w:lvl>
   </w:abstractNum>
-  <w:abstractNum w:abstractNumId="6">
+  <w:abstractNum w:abstractNumId="7">
     <w:nsid w:val="FCA41A8F"/>
     <w:multiLevelType w:val="singleLevel"/>
     <w:tmpl w:val="FCA41A8F"/>
@@ -5434,7 +5806,7 @@
       </w:rPr>
     </w:lvl>
   </w:abstractNum>
-  <w:abstractNum w:abstractNumId="7">
+  <w:abstractNum w:abstractNumId="8">
     <w:nsid w:val="1858A9E7"/>
     <w:multiLevelType w:val="singleLevel"/>
     <w:tmpl w:val="1858A9E7"/>
@@ -5454,7 +5826,7 @@
       </w:rPr>
     </w:lvl>
   </w:abstractNum>
-  <w:abstractNum w:abstractNumId="8">
+  <w:abstractNum w:abstractNumId="9">
     <w:nsid w:val="278578D1"/>
     <w:multiLevelType w:val="singleLevel"/>
     <w:tmpl w:val="278578D1"/>
@@ -5466,33 +5838,10 @@
       <w:lvlJc w:val="left"/>
     </w:lvl>
   </w:abstractNum>
-  <w:abstractNum w:abstractNumId="9">
+  <w:abstractNum w:abstractNumId="10">
     <w:nsid w:val="508CFA56"/>
     <w:multiLevelType w:val="singleLevel"/>
     <w:tmpl w:val="508CFA56"/>
-    <w:lvl w:ilvl="0" w:tentative="0">
-      <w:start w:val="1"/>
-      <w:numFmt w:val="bullet"/>
-      <w:lvlText w:val=""/>
-      <w:lvlJc w:val="left"/>
-      <w:pPr>
-        <w:tabs>
-          <w:tab w:val="left" w:pos="420"/>
-        </w:tabs>
-        <w:ind w:left="420" w:leftChars="0" w:hanging="420" w:firstLineChars="0"/>
-      </w:pPr>
-      <w:rPr>
-        <w:rFonts w:hint="default" w:ascii="Wingdings" w:hAnsi="Wingdings"/>
-        <w:color w:val="auto"/>
-        <w:sz w:val="18"/>
-        <w:szCs w:val="18"/>
-      </w:rPr>
-    </w:lvl>
-  </w:abstractNum>
-  <w:abstractNum w:abstractNumId="10">
-    <w:nsid w:val="55B7CD75"/>
-    <w:multiLevelType w:val="singleLevel"/>
-    <w:tmpl w:val="55B7CD75"/>
     <w:lvl w:ilvl="0" w:tentative="0">
       <w:start w:val="1"/>
       <w:numFmt w:val="bullet"/>
@@ -5513,6 +5862,29 @@
     </w:lvl>
   </w:abstractNum>
   <w:abstractNum w:abstractNumId="11">
+    <w:nsid w:val="55B7CD75"/>
+    <w:multiLevelType w:val="singleLevel"/>
+    <w:tmpl w:val="55B7CD75"/>
+    <w:lvl w:ilvl="0" w:tentative="0">
+      <w:start w:val="1"/>
+      <w:numFmt w:val="bullet"/>
+      <w:lvlText w:val=""/>
+      <w:lvlJc w:val="left"/>
+      <w:pPr>
+        <w:tabs>
+          <w:tab w:val="left" w:pos="420"/>
+        </w:tabs>
+        <w:ind w:left="420" w:leftChars="0" w:hanging="420" w:firstLineChars="0"/>
+      </w:pPr>
+      <w:rPr>
+        <w:rFonts w:hint="default" w:ascii="Wingdings" w:hAnsi="Wingdings"/>
+        <w:color w:val="auto"/>
+        <w:sz w:val="18"/>
+        <w:szCs w:val="18"/>
+      </w:rPr>
+    </w:lvl>
+  </w:abstractNum>
+  <w:abstractNum w:abstractNumId="12">
     <w:nsid w:val="7381B03C"/>
     <w:multiLevelType w:val="singleLevel"/>
     <w:tmpl w:val="7381B03C"/>
@@ -5535,40 +5907,43 @@
     </w:lvl>
   </w:abstractNum>
   <w:num w:numId="1">
-    <w:abstractNumId w:val="6"/>
+    <w:abstractNumId w:val="7"/>
   </w:num>
   <w:num w:numId="2">
-    <w:abstractNumId w:val="7"/>
+    <w:abstractNumId w:val="8"/>
   </w:num>
   <w:num w:numId="3">
     <w:abstractNumId w:val="1"/>
   </w:num>
   <w:num w:numId="4">
+    <w:abstractNumId w:val="11"/>
+  </w:num>
+  <w:num w:numId="5">
+    <w:abstractNumId w:val="6"/>
+  </w:num>
+  <w:num w:numId="6">
+    <w:abstractNumId w:val="5"/>
+  </w:num>
+  <w:num w:numId="7">
     <w:abstractNumId w:val="10"/>
   </w:num>
-  <w:num w:numId="5">
-    <w:abstractNumId w:val="5"/>
-  </w:num>
-  <w:num w:numId="6">
+  <w:num w:numId="8">
     <w:abstractNumId w:val="4"/>
   </w:num>
-  <w:num w:numId="7">
+  <w:num w:numId="9">
     <w:abstractNumId w:val="9"/>
   </w:num>
-  <w:num w:numId="8">
-    <w:abstractNumId w:val="3"/>
-  </w:num>
-  <w:num w:numId="9">
-    <w:abstractNumId w:val="8"/>
-  </w:num>
   <w:num w:numId="10">
-    <w:abstractNumId w:val="11"/>
+    <w:abstractNumId w:val="12"/>
   </w:num>
   <w:num w:numId="11">
     <w:abstractNumId w:val="0"/>
   </w:num>
   <w:num w:numId="12">
     <w:abstractNumId w:val="2"/>
+  </w:num>
+  <w:num w:numId="13">
+    <w:abstractNumId w:val="3"/>
   </w:num>
 </w:numbering>
 </file>

</xml_diff>

<commit_message>
End to end Verification
</commit_message>
<xml_diff>
--- a/Screenshots & Notes/Week 7 and 8 (Kubernetes + Frontend + Backend ).docx
+++ b/Screenshots & Notes/Week 7 and 8 (Kubernetes + Frontend + Backend ).docx
@@ -5125,6 +5125,37 @@
     <w:p>
       <w:pPr>
         <w:numPr>
+          <w:numId w:val="0"/>
+        </w:numPr>
+        <w:spacing w:line="360" w:lineRule="auto"/>
+        <w:ind w:leftChars="0"/>
+        <w:jc w:val="left"/>
+        <w:rPr>
+          <w:rFonts w:hint="default"/>
+          <w:b w:val="0"/>
+          <w:bCs w:val="0"/>
+          <w:color w:val="auto"/>
+          <w:sz w:val="24"/>
+          <w:szCs w:val="24"/>
+          <w:lang w:val="en-GB"/>
+        </w:rPr>
+      </w:pPr>
+      <w:r>
+        <w:rPr>
+          <w:rFonts w:hint="default"/>
+          <w:b w:val="0"/>
+          <w:bCs w:val="0"/>
+          <w:color w:val="auto"/>
+          <w:sz w:val="24"/>
+          <w:szCs w:val="24"/>
+          <w:lang w:val="en-GB"/>
+        </w:rPr>
+        <w:t>SSH into your VM</w:t>
+      </w:r>
+    </w:p>
+    <w:p>
+      <w:pPr>
+        <w:numPr>
           <w:ilvl w:val="0"/>
           <w:numId w:val="9"/>
         </w:numPr>
@@ -5335,7 +5366,7 @@
         <w:jc w:val="left"/>
         <w:rPr>
           <w:rFonts w:hint="default" w:ascii="Calibri" w:hAnsi="Calibri" w:eastAsia="SimSun" w:cs="Calibri"/>
-          <w:color w:val="auto"/>
+          <w:color w:val="00B050"/>
           <w:sz w:val="24"/>
           <w:szCs w:val="24"/>
           <w:lang w:val="en-GB"/>
@@ -5344,7 +5375,7 @@
       <w:r>
         <w:rPr>
           <w:rFonts w:hint="default" w:ascii="Calibri" w:hAnsi="Calibri" w:eastAsia="SimSun" w:cs="Calibri"/>
-          <w:color w:val="auto"/>
+          <w:color w:val="00B050"/>
           <w:sz w:val="24"/>
           <w:szCs w:val="24"/>
           <w:lang w:val="en-GB"/>
@@ -5358,271 +5389,764 @@
           <w:numId w:val="0"/>
         </w:numPr>
         <w:spacing w:line="360" w:lineRule="auto"/>
+        <w:ind w:leftChars="0"/>
         <w:jc w:val="left"/>
         <w:rPr>
-          <w:rFonts w:hint="default"/>
-          <w:b w:val="0"/>
-          <w:bCs w:val="0"/>
-          <w:color w:val="auto"/>
-          <w:sz w:val="24"/>
-          <w:szCs w:val="24"/>
-          <w:lang w:val="en-GB"/>
-        </w:rPr>
-      </w:pPr>
-    </w:p>
-    <w:p>
-      <w:pPr>
-        <w:numPr>
-          <w:numId w:val="0"/>
-        </w:numPr>
-        <w:spacing w:line="360" w:lineRule="auto"/>
+          <w:rFonts w:hint="default" w:ascii="Calibri" w:hAnsi="Calibri" w:eastAsia="SimSun" w:cs="Calibri"/>
+          <w:color w:val="00B050"/>
+          <w:sz w:val="24"/>
+          <w:szCs w:val="24"/>
+          <w:lang w:val="en-GB"/>
+        </w:rPr>
+      </w:pPr>
+      <w:r>
+        <w:drawing>
+          <wp:inline distT="0" distB="0" distL="114300" distR="114300">
+            <wp:extent cx="5271135" cy="1085850"/>
+            <wp:effectExtent l="0" t="0" r="5715" b="0"/>
+            <wp:docPr id="2" name="Picture 1"/>
+            <wp:cNvGraphicFramePr>
+              <a:graphicFrameLocks xmlns:a="http://schemas.openxmlformats.org/drawingml/2006/main" noChangeAspect="1"/>
+            </wp:cNvGraphicFramePr>
+            <a:graphic xmlns:a="http://schemas.openxmlformats.org/drawingml/2006/main">
+              <a:graphicData uri="http://schemas.openxmlformats.org/drawingml/2006/picture">
+                <pic:pic xmlns:pic="http://schemas.openxmlformats.org/drawingml/2006/picture">
+                  <pic:nvPicPr>
+                    <pic:cNvPr id="2" name="Picture 1"/>
+                    <pic:cNvPicPr>
+                      <a:picLocks noChangeAspect="1"/>
+                    </pic:cNvPicPr>
+                  </pic:nvPicPr>
+                  <pic:blipFill>
+                    <a:blip r:embed="rId5"/>
+                    <a:stretch>
+                      <a:fillRect/>
+                    </a:stretch>
+                  </pic:blipFill>
+                  <pic:spPr>
+                    <a:xfrm>
+                      <a:off x="0" y="0"/>
+                      <a:ext cx="5271135" cy="1085850"/>
+                    </a:xfrm>
+                    <a:prstGeom prst="rect">
+                      <a:avLst/>
+                    </a:prstGeom>
+                    <a:noFill/>
+                    <a:ln>
+                      <a:noFill/>
+                    </a:ln>
+                  </pic:spPr>
+                </pic:pic>
+              </a:graphicData>
+            </a:graphic>
+          </wp:inline>
+        </w:drawing>
+      </w:r>
+    </w:p>
+    <w:p>
+      <w:pPr>
+        <w:numPr>
+          <w:ilvl w:val="0"/>
+          <w:numId w:val="13"/>
+        </w:numPr>
+        <w:spacing w:line="360" w:lineRule="auto"/>
+        <w:ind w:left="420" w:leftChars="0" w:hanging="420" w:firstLineChars="0"/>
         <w:jc w:val="left"/>
         <w:rPr>
           <w:rFonts w:hint="default"/>
           <w:b w:val="0"/>
           <w:bCs w:val="0"/>
-          <w:color w:val="auto"/>
-          <w:sz w:val="24"/>
-          <w:szCs w:val="24"/>
-          <w:lang w:val="en-GB"/>
-        </w:rPr>
-      </w:pPr>
+          <w:color w:val="00B050"/>
+          <w:sz w:val="24"/>
+          <w:szCs w:val="24"/>
+          <w:lang w:val="en-GB"/>
+        </w:rPr>
+      </w:pPr>
+      <w:r>
+        <w:rPr>
+          <w:rFonts w:hint="default"/>
+          <w:b w:val="0"/>
+          <w:bCs w:val="0"/>
+          <w:color w:val="auto"/>
+          <w:sz w:val="24"/>
+          <w:szCs w:val="24"/>
+          <w:lang w:val="en-GB"/>
+        </w:rPr>
+        <w:t xml:space="preserve">Restart Jenkins :  </w:t>
+      </w:r>
+      <w:r>
+        <w:rPr>
+          <w:rFonts w:hint="default"/>
+          <w:b w:val="0"/>
+          <w:bCs w:val="0"/>
+          <w:color w:val="00B050"/>
+          <w:sz w:val="24"/>
+          <w:szCs w:val="24"/>
+          <w:lang w:val="en-GB"/>
+        </w:rPr>
+        <w:t>sudo systemctl restart jenkins</w:t>
+      </w:r>
+    </w:p>
+    <w:p>
+      <w:pPr>
+        <w:numPr>
+          <w:numId w:val="0"/>
+        </w:numPr>
+        <w:spacing w:line="360" w:lineRule="auto"/>
+        <w:jc w:val="left"/>
+        <w:rPr>
+          <w:rFonts w:hint="default"/>
+          <w:b w:val="0"/>
+          <w:bCs w:val="0"/>
+          <w:color w:val="auto"/>
+          <w:sz w:val="24"/>
+          <w:szCs w:val="24"/>
+          <w:lang w:val="en-GB"/>
+        </w:rPr>
+      </w:pPr>
+    </w:p>
+    <w:p>
+      <w:pPr>
+        <w:numPr>
+          <w:numId w:val="0"/>
+        </w:numPr>
+        <w:spacing w:line="360" w:lineRule="auto"/>
+        <w:jc w:val="left"/>
+        <w:rPr>
+          <w:rFonts w:hint="default"/>
+          <w:b w:val="0"/>
+          <w:bCs w:val="0"/>
+          <w:color w:val="auto"/>
+          <w:sz w:val="24"/>
+          <w:szCs w:val="24"/>
+          <w:lang w:val="en-GB"/>
+        </w:rPr>
+      </w:pPr>
+    </w:p>
+    <w:p>
+      <w:pPr>
+        <w:numPr>
+          <w:ilvl w:val="0"/>
+          <w:numId w:val="0"/>
+        </w:numPr>
+        <w:spacing w:line="360" w:lineRule="auto"/>
+        <w:ind w:leftChars="0"/>
+        <w:jc w:val="left"/>
+        <w:rPr>
+          <w:rFonts w:hint="default"/>
+          <w:b w:val="0"/>
+          <w:bCs w:val="0"/>
+          <w:color w:val="auto"/>
+          <w:sz w:val="24"/>
+          <w:szCs w:val="24"/>
+          <w:lang w:val="en-GB"/>
+        </w:rPr>
+      </w:pPr>
+      <w:r>
+        <w:rPr>
+          <w:rFonts w:hint="default"/>
+          <w:b w:val="0"/>
+          <w:bCs w:val="0"/>
+          <w:color w:val="auto"/>
+          <w:sz w:val="24"/>
+          <w:szCs w:val="24"/>
+          <w:lang w:val="en-GB"/>
+        </w:rPr>
+        <w:t xml:space="preserve">Test. </w:t>
+      </w:r>
+    </w:p>
+    <w:p>
+      <w:pPr>
+        <w:numPr>
+          <w:ilvl w:val="0"/>
+          <w:numId w:val="0"/>
+        </w:numPr>
+        <w:spacing w:line="360" w:lineRule="auto"/>
+        <w:ind w:leftChars="0"/>
+        <w:jc w:val="left"/>
+        <w:rPr>
+          <w:rFonts w:hint="default"/>
+          <w:b w:val="0"/>
+          <w:bCs w:val="0"/>
+          <w:color w:val="FF0000"/>
+          <w:sz w:val="24"/>
+          <w:szCs w:val="24"/>
+          <w:lang w:val="en-GB"/>
+        </w:rPr>
+      </w:pPr>
+      <w:r>
+        <w:rPr>
+          <w:rFonts w:hint="default"/>
+          <w:b w:val="0"/>
+          <w:bCs w:val="0"/>
+          <w:color w:val="FF0000"/>
+          <w:sz w:val="24"/>
+          <w:szCs w:val="24"/>
+          <w:lang w:val="en-GB"/>
+        </w:rPr>
+        <w:t>git add .</w:t>
+      </w:r>
+      <w:r>
+        <w:rPr>
+          <w:rFonts w:hint="default"/>
+          <w:b w:val="0"/>
+          <w:bCs w:val="0"/>
+          <w:color w:val="FF0000"/>
+          <w:sz w:val="24"/>
+          <w:szCs w:val="24"/>
+          <w:lang w:val="en-GB"/>
+        </w:rPr>
+        <w:br w:type="textWrapping"/>
+      </w:r>
+      <w:r>
+        <w:rPr>
+          <w:rFonts w:hint="default"/>
+          <w:b w:val="0"/>
+          <w:bCs w:val="0"/>
+          <w:color w:val="FF0000"/>
+          <w:sz w:val="24"/>
+          <w:szCs w:val="24"/>
+          <w:lang w:val="en-GB"/>
+        </w:rPr>
+        <w:t>git commit -m "add jenkins cicd"</w:t>
+      </w:r>
+      <w:r>
+        <w:rPr>
+          <w:rFonts w:hint="default"/>
+          <w:b w:val="0"/>
+          <w:bCs w:val="0"/>
+          <w:color w:val="FF0000"/>
+          <w:sz w:val="24"/>
+          <w:szCs w:val="24"/>
+          <w:lang w:val="en-GB"/>
+        </w:rPr>
+        <w:br w:type="textWrapping"/>
+      </w:r>
+      <w:r>
+        <w:rPr>
+          <w:rFonts w:hint="default"/>
+          <w:b w:val="0"/>
+          <w:bCs w:val="0"/>
+          <w:color w:val="FF0000"/>
+          <w:sz w:val="24"/>
+          <w:szCs w:val="24"/>
+          <w:lang w:val="en-GB"/>
+        </w:rPr>
+        <w:t>git push</w:t>
+      </w:r>
+    </w:p>
+    <w:p>
+      <w:pPr>
+        <w:numPr>
+          <w:ilvl w:val="0"/>
+          <w:numId w:val="0"/>
+        </w:numPr>
+        <w:spacing w:line="360" w:lineRule="auto"/>
+        <w:ind w:leftChars="0"/>
+        <w:jc w:val="left"/>
+        <w:rPr>
+          <w:rFonts w:hint="default"/>
+          <w:b w:val="0"/>
+          <w:bCs w:val="0"/>
+          <w:color w:val="FF0000"/>
+          <w:sz w:val="24"/>
+          <w:szCs w:val="24"/>
+          <w:lang w:val="en-GB"/>
+        </w:rPr>
+      </w:pPr>
+    </w:p>
+    <w:p>
+      <w:pPr>
+        <w:numPr>
+          <w:ilvl w:val="0"/>
+          <w:numId w:val="0"/>
+        </w:numPr>
+        <w:spacing w:line="360" w:lineRule="auto"/>
+        <w:ind w:leftChars="0"/>
+        <w:jc w:val="left"/>
+        <w:rPr>
+          <w:rFonts w:hint="default"/>
+          <w:b w:val="0"/>
+          <w:bCs w:val="0"/>
+          <w:color w:val="auto"/>
+          <w:sz w:val="24"/>
+          <w:szCs w:val="24"/>
+          <w:lang w:val="en-GB"/>
+        </w:rPr>
+      </w:pPr>
+      <w:r>
+        <w:rPr>
+          <w:rFonts w:hint="default"/>
+          <w:b w:val="0"/>
+          <w:bCs w:val="0"/>
+          <w:color w:val="auto"/>
+          <w:sz w:val="24"/>
+          <w:szCs w:val="24"/>
+          <w:lang w:val="en-GB"/>
+        </w:rPr>
+        <w:t>Jenkins will  securely push images and automatically deploy updates to Kubernetes, this completes a full CI/CD pipeline.</w:t>
+      </w:r>
+    </w:p>
+    <w:p>
+      <w:pPr>
+        <w:numPr>
+          <w:ilvl w:val="0"/>
+          <w:numId w:val="0"/>
+        </w:numPr>
+        <w:spacing w:line="360" w:lineRule="auto"/>
+        <w:ind w:leftChars="0"/>
+        <w:jc w:val="left"/>
+        <w:rPr>
+          <w:rFonts w:hint="default"/>
+          <w:b w:val="0"/>
+          <w:bCs w:val="0"/>
+          <w:color w:val="auto"/>
+          <w:sz w:val="24"/>
+          <w:szCs w:val="24"/>
+          <w:lang w:val="en-GB"/>
+        </w:rPr>
+      </w:pPr>
+    </w:p>
+    <w:p>
+      <w:pPr>
+        <w:numPr>
+          <w:ilvl w:val="0"/>
+          <w:numId w:val="9"/>
+        </w:numPr>
+        <w:spacing w:line="360" w:lineRule="auto"/>
+        <w:ind w:left="0" w:leftChars="0" w:firstLine="0" w:firstLineChars="0"/>
+        <w:jc w:val="left"/>
+        <w:rPr>
+          <w:rFonts w:hint="default"/>
+          <w:b w:val="0"/>
+          <w:bCs w:val="0"/>
+          <w:color w:val="auto"/>
+          <w:sz w:val="24"/>
+          <w:szCs w:val="24"/>
+          <w:lang w:val="en-GB"/>
+        </w:rPr>
+      </w:pPr>
+      <w:r>
+        <w:rPr>
+          <w:rFonts w:hint="default"/>
+          <w:b w:val="0"/>
+          <w:bCs w:val="0"/>
+          <w:color w:val="auto"/>
+          <w:sz w:val="24"/>
+          <w:szCs w:val="24"/>
+          <w:lang w:val="en-GB"/>
+        </w:rPr>
+        <w:t>Verify Pipeline:</w:t>
+      </w:r>
+    </w:p>
+    <w:p>
+      <w:pPr>
+        <w:numPr>
+          <w:ilvl w:val="0"/>
+          <w:numId w:val="0"/>
+        </w:numPr>
+        <w:spacing w:line="360" w:lineRule="auto"/>
+        <w:ind w:leftChars="0"/>
+        <w:jc w:val="left"/>
+        <w:rPr>
+          <w:rFonts w:hint="default"/>
+          <w:b w:val="0"/>
+          <w:bCs w:val="0"/>
+          <w:color w:val="00B050"/>
+          <w:sz w:val="24"/>
+          <w:szCs w:val="24"/>
+          <w:lang w:val="en-GB"/>
+        </w:rPr>
+      </w:pPr>
+      <w:r>
+        <w:rPr>
+          <w:rFonts w:hint="default"/>
+          <w:b w:val="0"/>
+          <w:bCs w:val="0"/>
+          <w:color w:val="auto"/>
+          <w:sz w:val="24"/>
+          <w:szCs w:val="24"/>
+          <w:lang w:val="en-GB"/>
+        </w:rPr>
+        <w:t xml:space="preserve">Run on your VM: </w:t>
+      </w:r>
+      <w:r>
+        <w:rPr>
+          <w:rFonts w:hint="default"/>
+          <w:b w:val="0"/>
+          <w:bCs w:val="0"/>
+          <w:color w:val="00B050"/>
+          <w:sz w:val="24"/>
+          <w:szCs w:val="24"/>
+          <w:lang w:val="en-GB"/>
+        </w:rPr>
+        <w:t>kubectl get pods</w:t>
+      </w:r>
+    </w:p>
+    <w:p>
+      <w:pPr>
+        <w:numPr>
+          <w:ilvl w:val="0"/>
+          <w:numId w:val="0"/>
+        </w:numPr>
+        <w:spacing w:line="360" w:lineRule="auto"/>
+        <w:ind w:leftChars="0"/>
+        <w:jc w:val="left"/>
+      </w:pPr>
+      <w:r>
+        <w:rPr>
+          <w:sz w:val="24"/>
+          <w:szCs w:val="24"/>
+        </w:rPr>
+        <w:t>You should see newly created Pods with a recent</w:t>
+      </w:r>
+      <w:r>
+        <w:t xml:space="preserve"> AGE:</w:t>
+      </w:r>
+      <w:r>
+        <w:drawing>
+          <wp:inline distT="0" distB="0" distL="114300" distR="114300">
+            <wp:extent cx="5263515" cy="1078865"/>
+            <wp:effectExtent l="0" t="0" r="13335" b="6985"/>
+            <wp:docPr id="3" name="Picture 2"/>
+            <wp:cNvGraphicFramePr>
+              <a:graphicFrameLocks xmlns:a="http://schemas.openxmlformats.org/drawingml/2006/main" noChangeAspect="1"/>
+            </wp:cNvGraphicFramePr>
+            <a:graphic xmlns:a="http://schemas.openxmlformats.org/drawingml/2006/main">
+              <a:graphicData uri="http://schemas.openxmlformats.org/drawingml/2006/picture">
+                <pic:pic xmlns:pic="http://schemas.openxmlformats.org/drawingml/2006/picture">
+                  <pic:nvPicPr>
+                    <pic:cNvPr id="3" name="Picture 2"/>
+                    <pic:cNvPicPr>
+                      <a:picLocks noChangeAspect="1"/>
+                    </pic:cNvPicPr>
+                  </pic:nvPicPr>
+                  <pic:blipFill>
+                    <a:blip r:embed="rId6"/>
+                    <a:stretch>
+                      <a:fillRect/>
+                    </a:stretch>
+                  </pic:blipFill>
+                  <pic:spPr>
+                    <a:xfrm>
+                      <a:off x="0" y="0"/>
+                      <a:ext cx="5263515" cy="1078865"/>
+                    </a:xfrm>
+                    <a:prstGeom prst="rect">
+                      <a:avLst/>
+                    </a:prstGeom>
+                    <a:noFill/>
+                    <a:ln>
+                      <a:noFill/>
+                    </a:ln>
+                  </pic:spPr>
+                </pic:pic>
+              </a:graphicData>
+            </a:graphic>
+          </wp:inline>
+        </w:drawing>
+      </w:r>
+    </w:p>
+    <w:p>
+      <w:pPr>
+        <w:numPr>
+          <w:ilvl w:val="0"/>
+          <w:numId w:val="0"/>
+        </w:numPr>
+        <w:spacing w:line="360" w:lineRule="auto"/>
+        <w:ind w:leftChars="0"/>
+        <w:jc w:val="left"/>
+      </w:pPr>
+    </w:p>
+    <w:p>
+      <w:pPr>
+        <w:numPr>
+          <w:ilvl w:val="0"/>
+          <w:numId w:val="0"/>
+        </w:numPr>
+        <w:spacing w:line="360" w:lineRule="auto"/>
+        <w:ind w:leftChars="0"/>
+        <w:jc w:val="left"/>
+        <w:rPr>
+          <w:rFonts w:hint="default"/>
+          <w:sz w:val="24"/>
+          <w:szCs w:val="24"/>
+          <w:lang w:val="en-GB"/>
+        </w:rPr>
+      </w:pPr>
+      <w:r>
+        <w:rPr>
+          <w:rFonts w:hint="default"/>
+          <w:sz w:val="24"/>
+          <w:szCs w:val="24"/>
+          <w:lang w:val="en-GB"/>
+        </w:rPr>
+        <w:t>Explanation</w:t>
+      </w:r>
+    </w:p>
+    <w:p>
+      <w:pPr>
+        <w:numPr>
+          <w:ilvl w:val="0"/>
+          <w:numId w:val="0"/>
+        </w:numPr>
+        <w:spacing w:line="360" w:lineRule="auto"/>
+        <w:ind w:leftChars="0"/>
+        <w:jc w:val="left"/>
+        <w:rPr>
+          <w:rFonts w:hint="default"/>
+          <w:sz w:val="24"/>
+          <w:szCs w:val="24"/>
+          <w:lang w:val="en-GB"/>
+        </w:rPr>
+      </w:pPr>
+      <w:r>
+        <w:rPr>
+          <w:rFonts w:hint="default"/>
+          <w:sz w:val="24"/>
+          <w:szCs w:val="24"/>
+          <w:lang w:val="en-GB"/>
+        </w:rPr>
+        <w:t>This confirms that:</w:t>
+      </w:r>
+    </w:p>
+    <w:p>
+      <w:pPr>
+        <w:numPr>
+          <w:ilvl w:val="0"/>
+          <w:numId w:val="14"/>
+        </w:numPr>
+        <w:spacing w:line="360" w:lineRule="auto"/>
+        <w:ind w:left="420" w:leftChars="0" w:hanging="420" w:firstLineChars="0"/>
+        <w:jc w:val="left"/>
+        <w:rPr>
+          <w:rFonts w:hint="default"/>
+          <w:sz w:val="24"/>
+          <w:szCs w:val="24"/>
+          <w:lang w:val="en-GB"/>
+        </w:rPr>
+      </w:pPr>
+      <w:r>
+        <w:rPr>
+          <w:rFonts w:hint="default"/>
+          <w:sz w:val="24"/>
+          <w:szCs w:val="24"/>
+          <w:lang w:val="en-GB"/>
+        </w:rPr>
+        <w:t xml:space="preserve">Jenkins successfully built and pushed new versioned images </w:t>
+      </w:r>
+    </w:p>
+    <w:p>
+      <w:pPr>
+        <w:numPr>
+          <w:ilvl w:val="0"/>
+          <w:numId w:val="14"/>
+        </w:numPr>
+        <w:spacing w:line="360" w:lineRule="auto"/>
+        <w:ind w:left="420" w:leftChars="0" w:hanging="420" w:firstLineChars="0"/>
+        <w:jc w:val="left"/>
+        <w:rPr>
+          <w:rFonts w:hint="default"/>
+          <w:sz w:val="24"/>
+          <w:szCs w:val="24"/>
+          <w:lang w:val="en-GB"/>
+        </w:rPr>
+      </w:pPr>
+      <w:r>
+        <w:rPr>
+          <w:rFonts w:hint="default"/>
+          <w:sz w:val="24"/>
+          <w:szCs w:val="24"/>
+          <w:lang w:val="en-GB"/>
+        </w:rPr>
+        <w:t xml:space="preserve">Kubernetes detected the new image version </w:t>
+      </w:r>
+    </w:p>
+    <w:p>
+      <w:pPr>
+        <w:numPr>
+          <w:ilvl w:val="0"/>
+          <w:numId w:val="14"/>
+        </w:numPr>
+        <w:spacing w:line="360" w:lineRule="auto"/>
+        <w:ind w:left="420" w:leftChars="0" w:hanging="420" w:firstLineChars="0"/>
+        <w:jc w:val="left"/>
+        <w:rPr>
+          <w:rFonts w:hint="default"/>
+          <w:sz w:val="24"/>
+          <w:szCs w:val="24"/>
+          <w:lang w:val="en-GB"/>
+        </w:rPr>
+      </w:pPr>
+      <w:r>
+        <w:rPr>
+          <w:rFonts w:hint="default"/>
+          <w:sz w:val="24"/>
+          <w:szCs w:val="24"/>
+          <w:lang w:val="en-GB"/>
+        </w:rPr>
+        <w:t>Kubernetes automatically performed a rolling update</w:t>
+      </w:r>
+    </w:p>
+    <w:p>
+      <w:pPr>
+        <w:numPr>
+          <w:ilvl w:val="0"/>
+          <w:numId w:val="0"/>
+        </w:numPr>
+        <w:spacing w:line="360" w:lineRule="auto"/>
+        <w:ind w:leftChars="0"/>
+        <w:jc w:val="left"/>
+        <w:rPr>
+          <w:rFonts w:hint="default"/>
+          <w:lang w:val="en-GB"/>
+        </w:rPr>
+      </w:pPr>
+    </w:p>
+    <w:p>
+      <w:pPr>
+        <w:numPr>
+          <w:ilvl w:val="0"/>
+          <w:numId w:val="9"/>
+        </w:numPr>
+        <w:spacing w:line="360" w:lineRule="auto"/>
+        <w:ind w:left="0" w:leftChars="0" w:firstLine="0" w:firstLineChars="0"/>
+        <w:jc w:val="left"/>
+        <w:rPr>
+          <w:rFonts w:hint="default"/>
+          <w:sz w:val="24"/>
+          <w:szCs w:val="24"/>
+          <w:lang w:val="en-GB"/>
+        </w:rPr>
+      </w:pPr>
+      <w:r>
+        <w:rPr>
+          <w:rFonts w:hint="default"/>
+          <w:sz w:val="24"/>
+          <w:szCs w:val="24"/>
+          <w:lang w:val="en-GB"/>
+        </w:rPr>
+        <w:t xml:space="preserve">Final Test - End-to-End Verification </w:t>
+      </w:r>
+    </w:p>
+    <w:p>
+      <w:pPr>
+        <w:numPr>
+          <w:ilvl w:val="0"/>
+          <w:numId w:val="15"/>
+        </w:numPr>
+        <w:spacing w:line="360" w:lineRule="auto"/>
+        <w:ind w:left="420" w:leftChars="0" w:hanging="420" w:firstLineChars="0"/>
+        <w:jc w:val="left"/>
+        <w:rPr>
+          <w:rFonts w:hint="default"/>
+          <w:sz w:val="24"/>
+          <w:szCs w:val="24"/>
+          <w:lang w:val="en-GB"/>
+        </w:rPr>
+      </w:pPr>
+      <w:r>
+        <w:rPr>
+          <w:rFonts w:hint="default"/>
+          <w:sz w:val="24"/>
+          <w:szCs w:val="24"/>
+          <w:lang w:val="en-GB"/>
+        </w:rPr>
+        <w:t>Make a Small Change in the html file.</w:t>
+      </w:r>
+    </w:p>
+    <w:p>
+      <w:pPr>
+        <w:numPr>
+          <w:ilvl w:val="0"/>
+          <w:numId w:val="15"/>
+        </w:numPr>
+        <w:spacing w:line="360" w:lineRule="auto"/>
+        <w:ind w:left="420" w:leftChars="0" w:hanging="420" w:firstLineChars="0"/>
+        <w:jc w:val="left"/>
+        <w:rPr>
+          <w:rFonts w:hint="default"/>
+          <w:sz w:val="24"/>
+          <w:szCs w:val="24"/>
+          <w:lang w:val="en-GB"/>
+        </w:rPr>
+      </w:pPr>
+      <w:r>
+        <w:rPr>
+          <w:rFonts w:hint="default"/>
+          <w:sz w:val="24"/>
+          <w:szCs w:val="24"/>
+          <w:lang w:val="en-GB"/>
+        </w:rPr>
+        <w:t>Commit and Push</w:t>
+      </w:r>
+    </w:p>
+    <w:p>
+      <w:pPr>
+        <w:numPr>
+          <w:ilvl w:val="0"/>
+          <w:numId w:val="15"/>
+        </w:numPr>
+        <w:spacing w:line="360" w:lineRule="auto"/>
+        <w:ind w:left="420" w:leftChars="0" w:hanging="420" w:firstLineChars="0"/>
+        <w:jc w:val="left"/>
+        <w:rPr>
+          <w:rFonts w:hint="default"/>
+          <w:color w:val="00B050"/>
+          <w:sz w:val="24"/>
+          <w:szCs w:val="24"/>
+          <w:lang w:val="en-GB"/>
+        </w:rPr>
+      </w:pPr>
+      <w:r>
+        <w:rPr>
+          <w:rFonts w:hint="default"/>
+          <w:sz w:val="24"/>
+          <w:szCs w:val="24"/>
+          <w:lang w:val="en-GB"/>
+        </w:rPr>
+        <w:t xml:space="preserve">Verify Kubernetes : </w:t>
+      </w:r>
+      <w:r>
+        <w:rPr>
+          <w:rFonts w:hint="default"/>
+          <w:color w:val="00B050"/>
+          <w:sz w:val="24"/>
+          <w:szCs w:val="24"/>
+          <w:lang w:val="en-GB"/>
+        </w:rPr>
+        <w:t>kubectl get pods</w:t>
+      </w:r>
+    </w:p>
+    <w:p>
+      <w:pPr>
+        <w:numPr>
+          <w:ilvl w:val="0"/>
+          <w:numId w:val="15"/>
+        </w:numPr>
+        <w:spacing w:line="360" w:lineRule="auto"/>
+        <w:ind w:left="420" w:leftChars="0" w:hanging="420" w:firstLineChars="0"/>
+        <w:jc w:val="left"/>
+        <w:rPr>
+          <w:rFonts w:hint="default"/>
+          <w:color w:val="auto"/>
+          <w:sz w:val="24"/>
+          <w:szCs w:val="24"/>
+          <w:lang w:val="en-GB"/>
+        </w:rPr>
+      </w:pPr>
+      <w:r>
+        <w:rPr>
+          <w:rFonts w:hint="default"/>
+          <w:color w:val="auto"/>
+          <w:sz w:val="24"/>
+          <w:szCs w:val="24"/>
+          <w:lang w:val="en-GB"/>
+        </w:rPr>
+        <w:t>Open the App in the browser to verify changes.</w:t>
+      </w:r>
       <w:bookmarkStart w:id="0" w:name="_GoBack"/>
       <w:bookmarkEnd w:id="0"/>
-    </w:p>
-    <w:p>
-      <w:pPr>
-        <w:numPr>
-          <w:numId w:val="0"/>
-        </w:numPr>
-        <w:spacing w:line="360" w:lineRule="auto"/>
-        <w:jc w:val="left"/>
-        <w:rPr>
-          <w:rFonts w:hint="default"/>
-          <w:b w:val="0"/>
-          <w:bCs w:val="0"/>
-          <w:color w:val="auto"/>
-          <w:sz w:val="24"/>
-          <w:szCs w:val="24"/>
-          <w:lang w:val="en-GB"/>
-        </w:rPr>
-      </w:pPr>
-    </w:p>
-    <w:p>
-      <w:pPr>
-        <w:numPr>
-          <w:ilvl w:val="0"/>
-          <w:numId w:val="0"/>
-        </w:numPr>
-        <w:spacing w:line="360" w:lineRule="auto"/>
-        <w:ind w:leftChars="0"/>
-        <w:jc w:val="left"/>
-        <w:rPr>
-          <w:rFonts w:hint="default"/>
-          <w:b w:val="0"/>
-          <w:bCs w:val="0"/>
-          <w:color w:val="auto"/>
-          <w:sz w:val="24"/>
-          <w:szCs w:val="24"/>
-          <w:lang w:val="en-GB"/>
-        </w:rPr>
-      </w:pPr>
-      <w:r>
-        <w:rPr>
-          <w:rFonts w:hint="default"/>
-          <w:b w:val="0"/>
-          <w:bCs w:val="0"/>
-          <w:color w:val="auto"/>
-          <w:sz w:val="24"/>
-          <w:szCs w:val="24"/>
-          <w:lang w:val="en-GB"/>
-        </w:rPr>
-        <w:t xml:space="preserve">Test. </w:t>
-      </w:r>
-    </w:p>
-    <w:p>
-      <w:pPr>
-        <w:numPr>
-          <w:ilvl w:val="0"/>
-          <w:numId w:val="0"/>
-        </w:numPr>
-        <w:spacing w:line="360" w:lineRule="auto"/>
-        <w:ind w:leftChars="0"/>
-        <w:jc w:val="left"/>
-        <w:rPr>
-          <w:rFonts w:hint="default"/>
-          <w:b w:val="0"/>
-          <w:bCs w:val="0"/>
-          <w:color w:val="FF0000"/>
-          <w:sz w:val="24"/>
-          <w:szCs w:val="24"/>
-          <w:lang w:val="en-GB"/>
-        </w:rPr>
-      </w:pPr>
-      <w:r>
-        <w:rPr>
-          <w:rFonts w:hint="default"/>
-          <w:b w:val="0"/>
-          <w:bCs w:val="0"/>
-          <w:color w:val="FF0000"/>
-          <w:sz w:val="24"/>
-          <w:szCs w:val="24"/>
-          <w:lang w:val="en-GB"/>
-        </w:rPr>
-        <w:t>git add .</w:t>
-      </w:r>
-      <w:r>
-        <w:rPr>
-          <w:rFonts w:hint="default"/>
-          <w:b w:val="0"/>
-          <w:bCs w:val="0"/>
-          <w:color w:val="FF0000"/>
-          <w:sz w:val="24"/>
-          <w:szCs w:val="24"/>
-          <w:lang w:val="en-GB"/>
-        </w:rPr>
-        <w:br w:type="textWrapping"/>
-      </w:r>
-      <w:r>
-        <w:rPr>
-          <w:rFonts w:hint="default"/>
-          <w:b w:val="0"/>
-          <w:bCs w:val="0"/>
-          <w:color w:val="FF0000"/>
-          <w:sz w:val="24"/>
-          <w:szCs w:val="24"/>
-          <w:lang w:val="en-GB"/>
-        </w:rPr>
-        <w:t>git commit -m "add jenkins cicd"</w:t>
-      </w:r>
-      <w:r>
-        <w:rPr>
-          <w:rFonts w:hint="default"/>
-          <w:b w:val="0"/>
-          <w:bCs w:val="0"/>
-          <w:color w:val="FF0000"/>
-          <w:sz w:val="24"/>
-          <w:szCs w:val="24"/>
-          <w:lang w:val="en-GB"/>
-        </w:rPr>
-        <w:br w:type="textWrapping"/>
-      </w:r>
-      <w:r>
-        <w:rPr>
-          <w:rFonts w:hint="default"/>
-          <w:b w:val="0"/>
-          <w:bCs w:val="0"/>
-          <w:color w:val="FF0000"/>
-          <w:sz w:val="24"/>
-          <w:szCs w:val="24"/>
-          <w:lang w:val="en-GB"/>
-        </w:rPr>
-        <w:t>git push</w:t>
-      </w:r>
-    </w:p>
-    <w:p>
-      <w:pPr>
-        <w:numPr>
-          <w:ilvl w:val="0"/>
-          <w:numId w:val="0"/>
-        </w:numPr>
-        <w:spacing w:line="360" w:lineRule="auto"/>
-        <w:ind w:leftChars="0"/>
-        <w:jc w:val="left"/>
-        <w:rPr>
-          <w:rFonts w:hint="default"/>
-          <w:b w:val="0"/>
-          <w:bCs w:val="0"/>
-          <w:color w:val="FF0000"/>
-          <w:sz w:val="24"/>
-          <w:szCs w:val="24"/>
-          <w:lang w:val="en-GB"/>
-        </w:rPr>
-      </w:pPr>
-    </w:p>
-    <w:p>
-      <w:pPr>
-        <w:numPr>
-          <w:ilvl w:val="0"/>
-          <w:numId w:val="0"/>
-        </w:numPr>
-        <w:spacing w:line="360" w:lineRule="auto"/>
-        <w:ind w:leftChars="0"/>
-        <w:jc w:val="left"/>
-        <w:rPr>
-          <w:rFonts w:hint="default"/>
-          <w:b w:val="0"/>
-          <w:bCs w:val="0"/>
-          <w:color w:val="auto"/>
-          <w:sz w:val="24"/>
-          <w:szCs w:val="24"/>
-          <w:lang w:val="en-GB"/>
-        </w:rPr>
-      </w:pPr>
-      <w:r>
-        <w:rPr>
-          <w:rFonts w:hint="default"/>
-          <w:b w:val="0"/>
-          <w:bCs w:val="0"/>
-          <w:color w:val="auto"/>
-          <w:sz w:val="24"/>
-          <w:szCs w:val="24"/>
-          <w:lang w:val="en-GB"/>
-        </w:rPr>
-        <w:t>Jenkins will  securely push images and automatically deploy updates to Kubernetes, this completes a full CI/CD pipeline.</w:t>
-      </w:r>
-    </w:p>
-    <w:p>
-      <w:pPr>
-        <w:numPr>
-          <w:ilvl w:val="0"/>
-          <w:numId w:val="0"/>
-        </w:numPr>
-        <w:spacing w:line="360" w:lineRule="auto"/>
-        <w:ind w:leftChars="0"/>
-        <w:jc w:val="left"/>
-        <w:rPr>
-          <w:rFonts w:hint="default"/>
-          <w:b w:val="0"/>
-          <w:bCs w:val="0"/>
-          <w:color w:val="auto"/>
-          <w:sz w:val="24"/>
-          <w:szCs w:val="24"/>
-          <w:lang w:val="en-GB"/>
-        </w:rPr>
-      </w:pPr>
-    </w:p>
-    <w:p>
-      <w:pPr>
-        <w:numPr>
-          <w:ilvl w:val="0"/>
-          <w:numId w:val="0"/>
-        </w:numPr>
-        <w:spacing w:line="360" w:lineRule="auto"/>
-        <w:ind w:leftChars="0"/>
-        <w:jc w:val="left"/>
-        <w:rPr>
-          <w:rFonts w:hint="default"/>
-          <w:b w:val="0"/>
-          <w:bCs w:val="0"/>
-          <w:color w:val="auto"/>
-          <w:sz w:val="24"/>
-          <w:szCs w:val="24"/>
-          <w:lang w:val="en-GB"/>
-        </w:rPr>
-      </w:pPr>
-      <w:r>
-        <w:rPr>
-          <w:rFonts w:hint="default"/>
-          <w:b w:val="0"/>
-          <w:bCs w:val="0"/>
-          <w:color w:val="auto"/>
-          <w:sz w:val="24"/>
-          <w:szCs w:val="24"/>
-          <w:lang w:val="en-GB"/>
-        </w:rPr>
-        <w:t xml:space="preserve">Verify the APP updated on changes. </w:t>
-      </w:r>
     </w:p>
     <w:sectPr>
       <w:pgSz w:w="11906" w:h="16838"/>
@@ -5697,9 +6221,9 @@
     </w:lvl>
   </w:abstractNum>
   <w:abstractNum w:abstractNumId="3">
-    <w:nsid w:val="C7888F19"/>
+    <w:nsid w:val="C3ED6D1C"/>
     <w:multiLevelType w:val="singleLevel"/>
-    <w:tmpl w:val="C7888F19"/>
+    <w:tmpl w:val="C3ED6D1C"/>
     <w:lvl w:ilvl="0" w:tentative="0">
       <w:start w:val="1"/>
       <w:numFmt w:val="bullet"/>
@@ -5720,6 +6244,29 @@
     </w:lvl>
   </w:abstractNum>
   <w:abstractNum w:abstractNumId="4">
+    <w:nsid w:val="C7888F19"/>
+    <w:multiLevelType w:val="singleLevel"/>
+    <w:tmpl w:val="C7888F19"/>
+    <w:lvl w:ilvl="0" w:tentative="0">
+      <w:start w:val="1"/>
+      <w:numFmt w:val="bullet"/>
+      <w:lvlText w:val=""/>
+      <w:lvlJc w:val="left"/>
+      <w:pPr>
+        <w:tabs>
+          <w:tab w:val="left" w:pos="420"/>
+        </w:tabs>
+        <w:ind w:left="420" w:leftChars="0" w:hanging="420" w:firstLineChars="0"/>
+      </w:pPr>
+      <w:rPr>
+        <w:rFonts w:hint="default" w:ascii="Wingdings" w:hAnsi="Wingdings"/>
+        <w:color w:val="auto"/>
+        <w:sz w:val="18"/>
+        <w:szCs w:val="18"/>
+      </w:rPr>
+    </w:lvl>
+  </w:abstractNum>
+  <w:abstractNum w:abstractNumId="5">
     <w:nsid w:val="D4180F91"/>
     <w:multiLevelType w:val="singleLevel"/>
     <w:tmpl w:val="D4180F91"/>
@@ -5739,7 +6286,7 @@
       </w:rPr>
     </w:lvl>
   </w:abstractNum>
-  <w:abstractNum w:abstractNumId="5">
+  <w:abstractNum w:abstractNumId="6">
     <w:nsid w:val="DA5EC560"/>
     <w:multiLevelType w:val="singleLevel"/>
     <w:tmpl w:val="DA5EC560"/>
@@ -5762,7 +6309,7 @@
       </w:rPr>
     </w:lvl>
   </w:abstractNum>
-  <w:abstractNum w:abstractNumId="6">
+  <w:abstractNum w:abstractNumId="7">
     <w:nsid w:val="E24E84D6"/>
     <w:multiLevelType w:val="singleLevel"/>
     <w:tmpl w:val="E24E84D6"/>
@@ -5784,7 +6331,7 @@
       </w:rPr>
     </w:lvl>
   </w:abstractNum>
-  <w:abstractNum w:abstractNumId="7">
+  <w:abstractNum w:abstractNumId="8">
     <w:nsid w:val="FCA41A8F"/>
     <w:multiLevelType w:val="singleLevel"/>
     <w:tmpl w:val="FCA41A8F"/>
@@ -5806,7 +6353,7 @@
       </w:rPr>
     </w:lvl>
   </w:abstractNum>
-  <w:abstractNum w:abstractNumId="8">
+  <w:abstractNum w:abstractNumId="9">
     <w:nsid w:val="1858A9E7"/>
     <w:multiLevelType w:val="singleLevel"/>
     <w:tmpl w:val="1858A9E7"/>
@@ -5826,7 +6373,7 @@
       </w:rPr>
     </w:lvl>
   </w:abstractNum>
-  <w:abstractNum w:abstractNumId="9">
+  <w:abstractNum w:abstractNumId="10">
     <w:nsid w:val="278578D1"/>
     <w:multiLevelType w:val="singleLevel"/>
     <w:tmpl w:val="278578D1"/>
@@ -5838,7 +6385,29 @@
       <w:lvlJc w:val="left"/>
     </w:lvl>
   </w:abstractNum>
-  <w:abstractNum w:abstractNumId="10">
+  <w:abstractNum w:abstractNumId="11">
+    <w:nsid w:val="38797C3D"/>
+    <w:multiLevelType w:val="singleLevel"/>
+    <w:tmpl w:val="38797C3D"/>
+    <w:lvl w:ilvl="0" w:tentative="0">
+      <w:start w:val="1"/>
+      <w:numFmt w:val="bullet"/>
+      <w:lvlText w:val=""/>
+      <w:lvlJc w:val="left"/>
+      <w:pPr>
+        <w:tabs>
+          <w:tab w:val="left" w:pos="420"/>
+        </w:tabs>
+        <w:ind w:left="420" w:leftChars="0" w:hanging="420" w:firstLineChars="0"/>
+      </w:pPr>
+      <w:rPr>
+        <w:rFonts w:hint="default" w:ascii="Wingdings" w:hAnsi="Wingdings"/>
+        <w:sz w:val="18"/>
+        <w:szCs w:val="18"/>
+      </w:rPr>
+    </w:lvl>
+  </w:abstractNum>
+  <w:abstractNum w:abstractNumId="12">
     <w:nsid w:val="508CFA56"/>
     <w:multiLevelType w:val="singleLevel"/>
     <w:tmpl w:val="508CFA56"/>
@@ -5861,7 +6430,7 @@
       </w:rPr>
     </w:lvl>
   </w:abstractNum>
-  <w:abstractNum w:abstractNumId="11">
+  <w:abstractNum w:abstractNumId="13">
     <w:nsid w:val="55B7CD75"/>
     <w:multiLevelType w:val="singleLevel"/>
     <w:tmpl w:val="55B7CD75"/>
@@ -5884,7 +6453,7 @@
       </w:rPr>
     </w:lvl>
   </w:abstractNum>
-  <w:abstractNum w:abstractNumId="12">
+  <w:abstractNum w:abstractNumId="14">
     <w:nsid w:val="7381B03C"/>
     <w:multiLevelType w:val="singleLevel"/>
     <w:tmpl w:val="7381B03C"/>
@@ -5907,34 +6476,34 @@
     </w:lvl>
   </w:abstractNum>
   <w:num w:numId="1">
-    <w:abstractNumId w:val="7"/>
+    <w:abstractNumId w:val="8"/>
   </w:num>
   <w:num w:numId="2">
-    <w:abstractNumId w:val="8"/>
+    <w:abstractNumId w:val="9"/>
   </w:num>
   <w:num w:numId="3">
     <w:abstractNumId w:val="1"/>
   </w:num>
   <w:num w:numId="4">
-    <w:abstractNumId w:val="11"/>
+    <w:abstractNumId w:val="13"/>
   </w:num>
   <w:num w:numId="5">
+    <w:abstractNumId w:val="7"/>
+  </w:num>
+  <w:num w:numId="6">
     <w:abstractNumId w:val="6"/>
   </w:num>
-  <w:num w:numId="6">
+  <w:num w:numId="7">
+    <w:abstractNumId w:val="12"/>
+  </w:num>
+  <w:num w:numId="8">
     <w:abstractNumId w:val="5"/>
   </w:num>
-  <w:num w:numId="7">
+  <w:num w:numId="9">
     <w:abstractNumId w:val="10"/>
   </w:num>
-  <w:num w:numId="8">
-    <w:abstractNumId w:val="4"/>
-  </w:num>
-  <w:num w:numId="9">
-    <w:abstractNumId w:val="9"/>
-  </w:num>
   <w:num w:numId="10">
-    <w:abstractNumId w:val="12"/>
+    <w:abstractNumId w:val="14"/>
   </w:num>
   <w:num w:numId="11">
     <w:abstractNumId w:val="0"/>
@@ -5943,6 +6512,12 @@
     <w:abstractNumId w:val="2"/>
   </w:num>
   <w:num w:numId="13">
+    <w:abstractNumId w:val="4"/>
+  </w:num>
+  <w:num w:numId="14">
+    <w:abstractNumId w:val="11"/>
+  </w:num>
+  <w:num w:numId="15">
     <w:abstractNumId w:val="3"/>
   </w:num>
 </w:numbering>

</xml_diff>

<commit_message>
refined read me for clarity
</commit_message>
<xml_diff>
--- a/Screenshots & Notes/Week 7 and 8 (Kubernetes + Frontend + Backend ).docx
+++ b/Screenshots & Notes/Week 7 and 8 (Kubernetes + Frontend + Backend ).docx
@@ -6145,6 +6145,23 @@
         </w:rPr>
         <w:t>Open the App in the browser to verify changes.</w:t>
       </w:r>
+    </w:p>
+    <w:p>
+      <w:pPr>
+        <w:numPr>
+          <w:numId w:val="0"/>
+        </w:numPr>
+        <w:spacing w:line="360" w:lineRule="auto"/>
+        <w:ind w:leftChars="0"/>
+        <w:jc w:val="left"/>
+        <w:rPr>
+          <w:rFonts w:hint="default"/>
+          <w:color w:val="auto"/>
+          <w:sz w:val="24"/>
+          <w:szCs w:val="24"/>
+          <w:lang w:val="en-GB"/>
+        </w:rPr>
+      </w:pPr>
       <w:bookmarkStart w:id="0" w:name="_GoBack"/>
       <w:bookmarkEnd w:id="0"/>
     </w:p>

</xml_diff>